<commit_message>
Quinta Versão - 02
</commit_message>
<xml_diff>
--- a/docs/sensor_especificacoes.docx
+++ b/docs/sensor_especificacoes.docx
@@ -1593,7 +1593,13 @@
         <w:t xml:space="preserve"> </w:t>
       </w:r>
       <w:r>
-        <w:t>SENSOR ÓPTICO RETROREFLEXIVO</w:t>
+        <w:t>SENSOR ÓPTICO RETROR</w:t>
+      </w:r>
+      <w:r>
+        <w:t>r</w:t>
+      </w:r>
+      <w:r>
+        <w:t>EFLEXIVO</w:t>
       </w:r>
     </w:p>
     <w:p>
@@ -1681,13 +1687,7 @@
         <w:pStyle w:val="Abnt-02"/>
       </w:pPr>
       <w:r>
-        <w:t>7.</w:t>
-      </w:r>
-      <w:r>
-        <w:t>6</w:t>
-      </w:r>
-      <w:r>
-        <w:t xml:space="preserve"> </w:t>
+        <w:t xml:space="preserve">7.6 </w:t>
       </w:r>
       <w:r>
         <w:t>SENSOR ÓPTICO DIFUSO</w:t>
@@ -2431,7 +2431,13 @@
         <w:spacing w:after="0"/>
       </w:pPr>
       <w:r>
-        <w:t>Para sensores ópticos retroreflexivos, o alvo padrão é um refletor catadióptrico (</w:t>
+        <w:t>Para sensores ópticos retror</w:t>
+      </w:r>
+      <w:r>
+        <w:t>r</w:t>
+      </w:r>
+      <w:r>
+        <w:t>eflexivos, o alvo padrão é um refletor catadióptrico (</w:t>
       </w:r>
       <w:r>
         <w:rPr>
@@ -4569,6 +4575,7 @@
   <w:style w:type="character" w:default="1" w:styleId="Fontepargpadro">
     <w:name w:val="Default Paragraph Font"/>
     <w:uiPriority w:val="1"/>
+    <w:semiHidden/>
     <w:unhideWhenUsed/>
   </w:style>
   <w:style w:type="table" w:default="1" w:styleId="Tabelanormal">

</xml_diff>